<commit_message>
Add deploy web UI, app/automation builders, dark/light theme, and full doc regeneration
- Deploy UI (deploy-ui.js): 10-page wizard with Qlik brand CSS, dark/light theme
  toggle, test connection button, responsive layout, toggle switch fixes
- Build Apps (build-apps.js): Engine API app builder from app-definitions.json
- Build Automations (build-automations.js): automation builder from definitions
- Generators: creation guide, setup guide, generate-all script
- Rename Qlik Sense → Qlik Analytics across all files
- Fix demo overview PPT: 2 apps (10 sheets), corrected GA dates
- Regenerate all documents, demo scripts, policies, SOPs, carrier contracts
- Add CI workflow, LICENSE, README, schema.sql, load scripts
- Remove legacy Python deploy script
- Merge Theme Upload into Build Apps page, remove .qvf app import
- Rename project to MCG Full Stack

Co-Authored-By: Claude Opus 4.6 <noreply@anthropic.com>
</commit_message>
<xml_diff>
--- a/documents/carrier_contracts/CARRIER-DPD-2025_Service_Agreement.docx
+++ b/documents/carrier_contracts/CARRIER-DPD-2025_Service_Agreement.docx
@@ -8039,7 +8039,7 @@
               <w:bottom w:val="none"/>
               <w:right w:val="none"/>
             </w:tcBorders>
-            <w:shd w:color="DC2626" w:val="solid"/>
+            <w:shd w:color="1B2A4A" w:val="solid"/>
           </w:tcPr>
           <w:p>
             <w:pPr>
@@ -12288,7 +12288,7 @@
               <w:bottom w:val="none"/>
               <w:right w:val="none"/>
             </w:tcBorders>
-            <w:shd w:color="DC2626" w:val="solid"/>
+            <w:shd w:color="1B2A4A" w:val="solid"/>
           </w:tcPr>
           <w:p>
             <w:pPr>

</xml_diff>